<commit_message>
Cyfry L.p. w wykazie budynku na środku komórki
Numery porządkowe siadały na różnych wysokościach — w wierszach 5–9 do 3 punktów
za wysoko. Winne były dwie rzeczy naraz: część akapitów miała interlinię z własnego
ustawienia, a część brała ją ze stylu, i znacznik końca akapitu był większy niż
cyfra (12 pt przy 7-punktowej). Wyśrodkowanie w pionie centruje wiersz tekstu,
a nie same cyfry, więc rozdmuchany znacznik podnosił je nad środek komórki.

Teraz cała kolumna ma jedną interlinię, znacznik w rozmiarze cyfry i wyśrodkowanie
w obu osiach. Zmierzone na wydruku (odległość środka cyfry od środka komórki):
przed 0,0 / 0,2 / 0,2 / 0,0 / -2,7 / -2,8 / -2,8 / -3,0 / -2,8 / 0,0 pt,
po -- w każdym wierszu w granicach ±0,7 pt.

Wykaz działki tej wady nie ma: tam kolumna była spójna od początku, więc formatki
nie ruszam.

Co-Authored-By: Claude Opus 5 <noreply@anthropic.com>
</commit_message>
<xml_diff>
--- a/szablony/wykaz_zmian_budynku_wzor.docx
+++ b/szablony/wykaz_zmian_budynku_wzor.docx
@@ -659,7 +659,8 @@
               <w:rPr>
                 <w:rFonts w:ascii="Bahnschrift SemiBold" w:hAnsi="Bahnschrift SemiBold"/>
                 <w:kern w:val="0"/>
-                <w:sz w:val="24"/>
+                <w:sz w:val="14"/>
+                <w:szCs w:val="14"/>
                 <w:lang w:eastAsia="zh-CN"/>
               </w:rPr>
             </w:pPr>
@@ -807,7 +808,8 @@
               <w:rPr>
                 <w:rFonts w:ascii="Bahnschrift SemiBold" w:hAnsi="Bahnschrift SemiBold"/>
                 <w:kern w:val="0"/>
-                <w:sz w:val="24"/>
+                <w:sz w:val="14"/>
+                <w:szCs w:val="14"/>
                 <w:lang w:eastAsia="zh-CN"/>
               </w:rPr>
             </w:pPr>
@@ -956,7 +958,8 @@
               <w:rPr>
                 <w:rFonts w:ascii="Bahnschrift SemiBold" w:hAnsi="Bahnschrift SemiBold"/>
                 <w:kern w:val="0"/>
-                <w:sz w:val="24"/>
+                <w:sz w:val="14"/>
+                <w:szCs w:val="14"/>
                 <w:lang w:eastAsia="zh-CN"/>
               </w:rPr>
             </w:pPr>
@@ -1102,7 +1105,8 @@
               <w:rPr>
                 <w:rFonts w:ascii="Bahnschrift SemiBold" w:hAnsi="Bahnschrift SemiBold"/>
                 <w:kern w:val="0"/>
-                <w:sz w:val="24"/>
+                <w:sz w:val="14"/>
+                <w:szCs w:val="14"/>
                 <w:lang w:eastAsia="zh-CN"/>
               </w:rPr>
             </w:pPr>
@@ -1265,7 +1269,8 @@
               <w:rPr>
                 <w:rFonts w:ascii="Bahnschrift SemiBold" w:hAnsi="Bahnschrift SemiBold"/>
                 <w:kern w:val="0"/>
-                <w:sz w:val="24"/>
+                <w:sz w:val="14"/>
+                <w:szCs w:val="14"/>
                 <w:lang w:eastAsia="zh-CN"/>
               </w:rPr>
             </w:pPr>
@@ -1415,11 +1420,13 @@
             <w:pPr>
               <w:suppressAutoHyphens/>
               <w:snapToGrid w:val="0"/>
+              <w:spacing w:line="240" w:lineRule="auto"/>
               <w:jc w:val="center"/>
               <w:rPr>
                 <w:rFonts w:ascii="Bahnschrift SemiBold" w:hAnsi="Bahnschrift SemiBold"/>
                 <w:kern w:val="0"/>
-                <w:sz w:val="24"/>
+                <w:sz w:val="14"/>
+                <w:szCs w:val="14"/>
                 <w:lang w:eastAsia="zh-CN"/>
               </w:rPr>
             </w:pPr>
@@ -1579,11 +1586,13 @@
             <w:pPr>
               <w:suppressAutoHyphens/>
               <w:snapToGrid w:val="0"/>
+              <w:spacing w:line="240" w:lineRule="auto"/>
               <w:jc w:val="center"/>
               <w:rPr>
                 <w:rFonts w:ascii="Bahnschrift SemiBold" w:hAnsi="Bahnschrift SemiBold"/>
                 <w:kern w:val="0"/>
-                <w:sz w:val="24"/>
+                <w:sz w:val="14"/>
+                <w:szCs w:val="14"/>
                 <w:lang w:eastAsia="zh-CN"/>
               </w:rPr>
             </w:pPr>
@@ -1765,12 +1774,13 @@
             <w:pPr>
               <w:suppressAutoHyphens/>
               <w:snapToGrid w:val="0"/>
+              <w:spacing w:line="240" w:lineRule="auto"/>
               <w:jc w:val="center"/>
               <w:rPr>
                 <w:rFonts w:ascii="Bahnschrift SemiBold" w:hAnsi="Bahnschrift SemiBold" w:cs="Tahoma"/>
                 <w:kern w:val="0"/>
                 <w:sz w:val="14"/>
-                <w:szCs w:val="18"/>
+                <w:szCs w:val="14"/>
                 <w:lang w:eastAsia="zh-CN"/>
               </w:rPr>
             </w:pPr>
@@ -1932,11 +1942,13 @@
             <w:pPr>
               <w:suppressAutoHyphens/>
               <w:snapToGrid w:val="0"/>
+              <w:spacing w:line="240" w:lineRule="auto"/>
               <w:jc w:val="center"/>
               <w:rPr>
                 <w:rFonts w:ascii="Bahnschrift SemiBold" w:hAnsi="Bahnschrift SemiBold"/>
                 <w:kern w:val="0"/>
-                <w:sz w:val="24"/>
+                <w:sz w:val="14"/>
+                <w:szCs w:val="14"/>
                 <w:lang w:eastAsia="zh-CN"/>
               </w:rPr>
             </w:pPr>
@@ -2093,11 +2105,13 @@
             <w:pPr>
               <w:suppressAutoHyphens/>
               <w:snapToGrid w:val="0"/>
+              <w:spacing w:line="240" w:lineRule="auto"/>
               <w:jc w:val="center"/>
               <w:rPr>
                 <w:rFonts w:ascii="Bahnschrift SemiBold" w:hAnsi="Bahnschrift SemiBold"/>
                 <w:kern w:val="0"/>
-                <w:sz w:val="24"/>
+                <w:sz w:val="14"/>
+                <w:szCs w:val="14"/>
                 <w:lang w:eastAsia="zh-CN"/>
               </w:rPr>
             </w:pPr>
@@ -2273,12 +2287,13 @@
             <w:pPr>
               <w:suppressAutoHyphens/>
               <w:snapToGrid w:val="0"/>
+              <w:spacing w:line="240" w:lineRule="auto"/>
               <w:jc w:val="center"/>
               <w:rPr>
                 <w:rFonts w:ascii="Bahnschrift SemiBold" w:hAnsi="Bahnschrift SemiBold" w:cs="Tahoma"/>
                 <w:kern w:val="0"/>
                 <w:sz w:val="14"/>
-                <w:szCs w:val="18"/>
+                <w:szCs w:val="14"/>
                 <w:lang w:eastAsia="zh-CN"/>
               </w:rPr>
             </w:pPr>
@@ -2435,12 +2450,13 @@
             <w:pPr>
               <w:suppressAutoHyphens/>
               <w:snapToGrid w:val="0"/>
+              <w:spacing w:line="240" w:lineRule="auto"/>
               <w:jc w:val="center"/>
               <w:rPr>
                 <w:rFonts w:ascii="Bahnschrift SemiBold" w:hAnsi="Bahnschrift SemiBold" w:cs="Tahoma"/>
                 <w:kern w:val="0"/>
                 <w:sz w:val="14"/>
-                <w:szCs w:val="18"/>
+                <w:szCs w:val="14"/>
                 <w:lang w:eastAsia="zh-CN"/>
               </w:rPr>
             </w:pPr>
@@ -2597,11 +2613,13 @@
             <w:pPr>
               <w:suppressAutoHyphens/>
               <w:snapToGrid w:val="0"/>
+              <w:spacing w:line="240" w:lineRule="auto"/>
               <w:jc w:val="center"/>
               <w:rPr>
                 <w:rFonts w:ascii="Bahnschrift SemiBold" w:hAnsi="Bahnschrift SemiBold"/>
                 <w:kern w:val="0"/>
-                <w:sz w:val="24"/>
+                <w:sz w:val="14"/>
+                <w:szCs w:val="14"/>
                 <w:lang w:eastAsia="zh-CN"/>
               </w:rPr>
             </w:pPr>
@@ -2777,12 +2795,13 @@
             <w:pPr>
               <w:suppressAutoHyphens/>
               <w:snapToGrid w:val="0"/>
+              <w:spacing w:line="240" w:lineRule="auto"/>
               <w:jc w:val="center"/>
               <w:rPr>
                 <w:rFonts w:ascii="Bahnschrift SemiBold" w:hAnsi="Bahnschrift SemiBold" w:cs="Tahoma"/>
                 <w:kern w:val="0"/>
                 <w:sz w:val="14"/>
-                <w:szCs w:val="18"/>
+                <w:szCs w:val="14"/>
                 <w:lang w:eastAsia="zh-CN"/>
               </w:rPr>
             </w:pPr>
@@ -2939,12 +2958,13 @@
             <w:pPr>
               <w:suppressAutoHyphens/>
               <w:snapToGrid w:val="0"/>
+              <w:spacing w:line="240" w:lineRule="auto"/>
               <w:jc w:val="center"/>
               <w:rPr>
                 <w:rFonts w:ascii="Bahnschrift SemiBold" w:hAnsi="Bahnschrift SemiBold" w:cs="Tahoma"/>
                 <w:kern w:val="0"/>
                 <w:sz w:val="14"/>
-                <w:szCs w:val="18"/>
+                <w:szCs w:val="14"/>
                 <w:lang w:eastAsia="zh-CN"/>
               </w:rPr>
             </w:pPr>
@@ -3104,7 +3124,8 @@
               <w:rPr>
                 <w:rFonts w:ascii="Bahnschrift SemiBold" w:hAnsi="Bahnschrift SemiBold"/>
                 <w:kern w:val="0"/>
-                <w:sz w:val="24"/>
+                <w:sz w:val="14"/>
+                <w:szCs w:val="14"/>
                 <w:lang w:eastAsia="zh-CN"/>
               </w:rPr>
             </w:pPr>

</xml_diff>